<commit_message>
Add 'Engagement team members' row to Compliance and Developer Test Report templates
Adds an Engagement team members field to the front-page table of all eight
Lab Templates (MASA Android/iOS, CASA, and Cloud App and Config — both
Compliance Report and Developer Test Report), positioned between Summary and
Approved by. This lets the CB verify the personnel who performed the
assessment hold the qualifications required by the ADA scope.

Resolves #206
</commit_message>
<xml_diff>
--- a/Submission Forms and Templates/Lab Templates/CASA Compliance Report.docx
+++ b/Submission Forms and Templates/Lab Templates/CASA Compliance Report.docx
@@ -150,15 +150,7 @@
                 <w:sz w:val="42"/>
                 <w:szCs w:val="42"/>
               </w:rPr>
-              <w:t>CASA</w:t>
-            </w:r>
-            <w:r>
-              <w:rPr>
-                <w:color w:val="FFFFFF"/>
-                <w:sz w:val="42"/>
-                <w:szCs w:val="42"/>
-              </w:rPr>
-              <w:t xml:space="preserve"> Compliance Report</w:t>
+              <w:t>CASA Compliance Report</w:t>
             </w:r>
           </w:p>
           <w:p>
@@ -406,10 +398,7 @@
               <w:ind w:left="180"/>
             </w:pPr>
             <w:r>
-              <w:t>CASA</w:t>
-            </w:r>
-            <w:r>
-              <w:t xml:space="preserve"> Specification Version</w:t>
+              <w:t>CASA Specification Version</w:t>
             </w:r>
           </w:p>
         </w:tc>
@@ -589,6 +578,93 @@
             <w:r>
               <w:t>(IN COMPLIANCE, REMEDIATION REQUIRED)</w:t>
             </w:r>
+          </w:p>
+        </w:tc>
+      </w:tr>
+      <w:tr>
+        <w:trPr>
+          <w:trHeight w:val="420"/>
+          <w:jc w:val="center"/>
+        </w:trPr>
+        <w:tc>
+          <w:tcPr>
+            <w:tcW w:w="5145" w:type="dxa"/>
+            <w:tcMar>
+              <w:top w:w="100" w:type="dxa"/>
+              <w:left w:w="100" w:type="dxa"/>
+              <w:bottom w:w="100" w:type="dxa"/>
+              <w:right w:w="100" w:type="dxa"/>
+            </w:tcMar>
+          </w:tcPr>
+          <w:p>
+            <w:pPr>
+              <w:widowControl w:val="0"/>
+              <w:pBdr>
+                <w:top w:val="nil"/>
+                <w:left w:val="nil"/>
+                <w:bottom w:val="nil"/>
+                <w:right w:val="nil"/>
+                <w:between w:val="nil"/>
+              </w:pBdr>
+              <w:spacing w:line="240" w:lineRule="auto"/>
+              <w:ind w:left="180"/>
+            </w:pPr>
+          </w:p>
+          <w:p>
+            <w:pPr>
+              <w:widowControl w:val="0"/>
+              <w:pBdr>
+                <w:top w:val="nil"/>
+                <w:left w:val="nil"/>
+                <w:bottom w:val="nil"/>
+                <w:right w:val="nil"/>
+                <w:between w:val="nil"/>
+              </w:pBdr>
+              <w:spacing w:line="240" w:lineRule="auto"/>
+              <w:ind w:left="180"/>
+            </w:pPr>
+            <w:r>
+              <w:t>Engagement team members</w:t>
+            </w:r>
+          </w:p>
+          <w:p>
+            <w:pPr>
+              <w:widowControl w:val="0"/>
+              <w:pBdr>
+                <w:top w:val="nil"/>
+                <w:left w:val="nil"/>
+                <w:bottom w:val="nil"/>
+                <w:right w:val="nil"/>
+                <w:between w:val="nil"/>
+              </w:pBdr>
+              <w:spacing w:line="240" w:lineRule="auto"/>
+              <w:ind w:left="180"/>
+            </w:pPr>
+          </w:p>
+        </w:tc>
+        <w:tc>
+          <w:tcPr>
+            <w:tcW w:w="5250" w:type="dxa"/>
+            <w:shd w:val="clear" w:color="auto" w:fill="EFEFEF"/>
+            <w:tcMar>
+              <w:top w:w="100" w:type="dxa"/>
+              <w:left w:w="100" w:type="dxa"/>
+              <w:bottom w:w="100" w:type="dxa"/>
+              <w:right w:w="100" w:type="dxa"/>
+            </w:tcMar>
+          </w:tcPr>
+          <w:p>
+            <w:pPr>
+              <w:widowControl w:val="0"/>
+              <w:pBdr>
+                <w:top w:val="nil"/>
+                <w:left w:val="nil"/>
+                <w:bottom w:val="nil"/>
+                <w:right w:val="nil"/>
+                <w:between w:val="nil"/>
+              </w:pBdr>
+              <w:spacing w:line="240" w:lineRule="auto"/>
+            </w:pPr>
           </w:p>
         </w:tc>
       </w:tr>
@@ -5318,7 +5394,16 @@
                 <w:bCs/>
                 <w:color w:val="FFFFFF"/>
               </w:rPr>
-              <w:t>Onboarding Questionnaire Filename and Hash</w:t>
+              <w:t xml:space="preserve">Onboarding Questionnaire </w:t>
+            </w:r>
+            <w:r>
+              <w:rPr>
+                <w:b/>
+                <w:bCs/>
+                <w:color w:val="FFFFFF"/>
+              </w:rPr>
+              <w:lastRenderedPageBreak/>
+              <w:t>Filename and Hash</w:t>
             </w:r>
           </w:p>
         </w:tc>
@@ -5935,6 +6020,7 @@
       <w:bookmarkStart w:id="4" w:name="_p602if8t98qk" w:colFirst="0" w:colLast="0"/>
       <w:bookmarkEnd w:id="4"/>
       <w:r>
+        <w:lastRenderedPageBreak/>
         <w:t>Remarks and Comments</w:t>
       </w:r>
     </w:p>

</xml_diff>